<commit_message>
Remove sensitive key file
</commit_message>
<xml_diff>
--- a/project_implementation.docx
+++ b/project_implementation.docx
@@ -1,6 +1,6 @@
 
 <file path=word/document.xml><?xml version="1.0" encoding="utf-8"?>
-<w:document xmlns:wpc="http://schemas.microsoft.com/office/word/2010/wordprocessingCanvas" xmlns:cx="http://schemas.microsoft.com/office/drawing/2014/chartex" xmlns:cx1="http://schemas.microsoft.com/office/drawing/2015/9/8/chartex" xmlns:cx2="http://schemas.microsoft.com/office/drawing/2015/10/21/chartex" xmlns:cx3="http://schemas.microsoft.com/office/drawing/2016/5/9/chartex" xmlns:cx4="http://schemas.microsoft.com/office/drawing/2016/5/10/chartex" xmlns:cx5="http://schemas.microsoft.com/office/drawing/2016/5/11/chartex" xmlns:cx6="http://schemas.microsoft.com/office/drawing/2016/5/12/chartex" xmlns:cx7="http://schemas.microsoft.com/office/drawing/2016/5/13/chartex" xmlns:cx8="http://schemas.microsoft.com/office/drawing/2016/5/14/chartex" xmlns:mc="http://schemas.openxmlformats.org/markup-compatibility/2006" xmlns:aink="http://schemas.microsoft.com/office/drawing/2016/ink" xmlns:am3d="http://schemas.microsoft.com/office/drawing/2017/model3d" xmlns:o="urn:schemas-microsoft-com:office:office" xmlns:r="http://schemas.openxmlformats.org/officeDocument/2006/relationships" xmlns:m="http://schemas.openxmlformats.org/officeDocument/2006/math" xmlns:v="urn:schemas-microsoft-com:vml" xmlns:wp14="http://schemas.microsoft.com/office/word/2010/wordprocessingDrawing" xmlns:wp="http://schemas.openxmlformats.org/drawingml/2006/wordprocessingDrawing" xmlns:w10="urn:schemas-microsoft-com:office:word" xmlns:w="http://schemas.openxmlformats.org/wordprocessingml/2006/main" xmlns:w14="http://schemas.microsoft.com/office/word/2010/wordml" xmlns:w15="http://schemas.microsoft.com/office/word/2012/wordml" xmlns:w16cid="http://schemas.microsoft.com/office/word/2016/wordml/cid" xmlns:w16se="http://schemas.microsoft.com/office/word/2015/wordml/symex" xmlns:wpg="http://schemas.microsoft.com/office/word/2010/wordprocessingGroup" xmlns:wpi="http://schemas.microsoft.com/office/word/2010/wordprocessingInk" xmlns:wne="http://schemas.microsoft.com/office/word/2006/wordml" xmlns:wps="http://schemas.microsoft.com/office/word/2010/wordprocessingShape" mc:Ignorable="w14 w15 w16se w16cid wp14">
+<w:document xmlns:wpc="http://schemas.microsoft.com/office/word/2010/wordprocessingCanvas" xmlns:cx="http://schemas.microsoft.com/office/drawing/2014/chartex" xmlns:cx1="http://schemas.microsoft.com/office/drawing/2015/9/8/chartex" xmlns:cx2="http://schemas.microsoft.com/office/drawing/2015/10/21/chartex" xmlns:cx3="http://schemas.microsoft.com/office/drawing/2016/5/9/chartex" xmlns:cx4="http://schemas.microsoft.com/office/drawing/2016/5/10/chartex" xmlns:cx5="http://schemas.microsoft.com/office/drawing/2016/5/11/chartex" xmlns:cx6="http://schemas.microsoft.com/office/drawing/2016/5/12/chartex" xmlns:cx7="http://schemas.microsoft.com/office/drawing/2016/5/13/chartex" xmlns:cx8="http://schemas.microsoft.com/office/drawing/2016/5/14/chartex" xmlns:mc="http://schemas.openxmlformats.org/markup-compatibility/2006" xmlns:aink="http://schemas.microsoft.com/office/drawing/2016/ink" xmlns:am3d="http://schemas.microsoft.com/office/drawing/2017/model3d" xmlns:o="urn:schemas-microsoft-com:office:office" xmlns:oel="http://schemas.microsoft.com/office/2019/extlst" xmlns:r="http://schemas.openxmlformats.org/officeDocument/2006/relationships" xmlns:m="http://schemas.openxmlformats.org/officeDocument/2006/math" xmlns:v="urn:schemas-microsoft-com:vml" xmlns:wp14="http://schemas.microsoft.com/office/word/2010/wordprocessingDrawing" xmlns:wp="http://schemas.openxmlformats.org/drawingml/2006/wordprocessingDrawing" xmlns:w10="urn:schemas-microsoft-com:office:word" xmlns:w="http://schemas.openxmlformats.org/wordprocessingml/2006/main" xmlns:w14="http://schemas.microsoft.com/office/word/2010/wordml" xmlns:w15="http://schemas.microsoft.com/office/word/2012/wordml" xmlns:w16cex="http://schemas.microsoft.com/office/word/2018/wordml/cex" xmlns:w16cid="http://schemas.microsoft.com/office/word/2016/wordml/cid" xmlns:w16="http://schemas.microsoft.com/office/word/2018/wordml" xmlns:w16du="http://schemas.microsoft.com/office/word/2023/wordml/word16du" xmlns:w16sdtdh="http://schemas.microsoft.com/office/word/2020/wordml/sdtdatahash" xmlns:w16sdtfl="http://schemas.microsoft.com/office/word/2024/wordml/sdtformatlock" xmlns:w16se="http://schemas.microsoft.com/office/word/2015/wordml/symex" xmlns:wpg="http://schemas.microsoft.com/office/word/2010/wordprocessingGroup" xmlns:wpi="http://schemas.microsoft.com/office/word/2010/wordprocessingInk" xmlns:wne="http://schemas.microsoft.com/office/word/2006/wordml" xmlns:wps="http://schemas.microsoft.com/office/word/2010/wordprocessingShape" mc:Ignorable="w14 w15 w16se w16cid w16 w16cex w16sdtdh w16sdtfl w16du wp14">
   <w:body>
     <w:p>
       <w:pPr>
@@ -14259,21 +14259,7 @@
         <w:rPr>
           <w:sz w:val="32"/>
         </w:rPr>
-        <w:t>="</w:t>
-      </w:r>
-      <w:proofErr w:type="spellStart"/>
-      <w:r>
-        <w:rPr>
-          <w:sz w:val="32"/>
-        </w:rPr>
-        <w:t>ssh</w:t>
-      </w:r>
-      <w:proofErr w:type="spellEnd"/>
-      <w:r>
-        <w:rPr>
-          <w:sz w:val="32"/>
-        </w:rPr>
-        <w:t xml:space="preserve"> -</w:t>
+        <w:t>="ssh -</w:t>
       </w:r>
       <w:proofErr w:type="spellStart"/>
       <w:r>
@@ -14903,39 +14889,103 @@
       <w:proofErr w:type="spellEnd"/>
       <w:proofErr w:type="gramEnd"/>
       <w:r>
-        <w:t>('admin'); if (!</w:t>
-      </w:r>
-      <w:proofErr w:type="spellStart"/>
-      <w:r>
-        <w:t>db.getUser</w:t>
-      </w:r>
-      <w:proofErr w:type="spellEnd"/>
-      <w:r>
-        <w:t xml:space="preserve">('{{ </w:t>
-      </w:r>
-      <w:proofErr w:type="spellStart"/>
-      <w:r>
-        <w:t>mongo_admin_user</w:t>
-      </w:r>
-      <w:proofErr w:type="spellEnd"/>
-      <w:r>
-        <w:t xml:space="preserve"> }}')) { </w:t>
-      </w:r>
-      <w:proofErr w:type="spellStart"/>
-      <w:r>
-        <w:t>db.createUser</w:t>
-      </w:r>
-      <w:proofErr w:type="spellEnd"/>
-      <w:r>
-        <w:t xml:space="preserve">({ user: '{{ </w:t>
-      </w:r>
-      <w:proofErr w:type="spellStart"/>
-      <w:r>
-        <w:t>mongo_admin_user</w:t>
-      </w:r>
-      <w:proofErr w:type="spellEnd"/>
-      <w:r>
-        <w:t xml:space="preserve"> }}', </w:t>
+        <w:t xml:space="preserve">('admin'); if </w:t>
+      </w:r>
+      <w:proofErr w:type="gramStart"/>
+      <w:r>
+        <w:t>(!</w:t>
+      </w:r>
+      <w:proofErr w:type="spellStart"/>
+      <w:r>
+        <w:t>db</w:t>
+      </w:r>
+      <w:proofErr w:type="gramEnd"/>
+      <w:r>
+        <w:t>.</w:t>
+      </w:r>
+      <w:proofErr w:type="gramStart"/>
+      <w:r>
+        <w:t>getUser</w:t>
+      </w:r>
+      <w:proofErr w:type="spellEnd"/>
+      <w:r>
+        <w:t>(</w:t>
+      </w:r>
+      <w:proofErr w:type="gramEnd"/>
+      <w:r>
+        <w:t>'</w:t>
+      </w:r>
+      <w:proofErr w:type="gramStart"/>
+      <w:r>
+        <w:t xml:space="preserve">{{ </w:t>
+      </w:r>
+      <w:proofErr w:type="spellStart"/>
+      <w:r>
+        <w:t>mongo</w:t>
+      </w:r>
+      <w:proofErr w:type="gramEnd"/>
+      <w:r>
+        <w:t>_admin_</w:t>
+      </w:r>
+      <w:proofErr w:type="gramStart"/>
+      <w:r>
+        <w:t>user</w:t>
+      </w:r>
+      <w:proofErr w:type="spellEnd"/>
+      <w:r>
+        <w:t xml:space="preserve"> }}'</w:t>
+      </w:r>
+      <w:proofErr w:type="gramEnd"/>
+      <w:r>
+        <w:t xml:space="preserve">)) </w:t>
+      </w:r>
+      <w:proofErr w:type="gramStart"/>
+      <w:r>
+        <w:t xml:space="preserve">{ </w:t>
+      </w:r>
+      <w:proofErr w:type="spellStart"/>
+      <w:r>
+        <w:t>db</w:t>
+      </w:r>
+      <w:proofErr w:type="gramEnd"/>
+      <w:r>
+        <w:t>.</w:t>
+      </w:r>
+      <w:proofErr w:type="gramStart"/>
+      <w:r>
+        <w:t>createUser</w:t>
+      </w:r>
+      <w:proofErr w:type="spellEnd"/>
+      <w:r>
+        <w:t>({ user</w:t>
+      </w:r>
+      <w:proofErr w:type="gramEnd"/>
+      <w:r>
+        <w:t>: '</w:t>
+      </w:r>
+      <w:proofErr w:type="gramStart"/>
+      <w:r>
+        <w:t xml:space="preserve">{{ </w:t>
+      </w:r>
+      <w:proofErr w:type="spellStart"/>
+      <w:r>
+        <w:t>mongo</w:t>
+      </w:r>
+      <w:proofErr w:type="gramEnd"/>
+      <w:r>
+        <w:t>_admin_</w:t>
+      </w:r>
+      <w:proofErr w:type="gramStart"/>
+      <w:r>
+        <w:t>user</w:t>
+      </w:r>
+      <w:proofErr w:type="spellEnd"/>
+      <w:r>
+        <w:t xml:space="preserve"> }}'</w:t>
+      </w:r>
+      <w:proofErr w:type="gramEnd"/>
+      <w:r>
+        <w:t xml:space="preserve">, </w:t>
       </w:r>
       <w:proofErr w:type="spellStart"/>
       <w:r>
@@ -14943,15 +14993,39 @@
       </w:r>
       <w:proofErr w:type="spellEnd"/>
       <w:r>
-        <w:t xml:space="preserve">: '{{ </w:t>
-      </w:r>
-      <w:proofErr w:type="spellStart"/>
-      <w:r>
-        <w:t>mongo_admin_password</w:t>
-      </w:r>
-      <w:proofErr w:type="spellEnd"/>
-      <w:r>
-        <w:t xml:space="preserve"> }}', roles: [{ role: 'root', </w:t>
+        <w:t>: '</w:t>
+      </w:r>
+      <w:proofErr w:type="gramStart"/>
+      <w:r>
+        <w:t xml:space="preserve">{{ </w:t>
+      </w:r>
+      <w:proofErr w:type="spellStart"/>
+      <w:r>
+        <w:t>mongo</w:t>
+      </w:r>
+      <w:proofErr w:type="gramEnd"/>
+      <w:r>
+        <w:t>_admin_</w:t>
+      </w:r>
+      <w:proofErr w:type="gramStart"/>
+      <w:r>
+        <w:t>password</w:t>
+      </w:r>
+      <w:proofErr w:type="spellEnd"/>
+      <w:r>
+        <w:t xml:space="preserve"> }}'</w:t>
+      </w:r>
+      <w:proofErr w:type="gramEnd"/>
+      <w:r>
+        <w:t xml:space="preserve">, roles: </w:t>
+      </w:r>
+      <w:proofErr w:type="gramStart"/>
+      <w:r>
+        <w:t>[{ role</w:t>
+      </w:r>
+      <w:proofErr w:type="gramEnd"/>
+      <w:r>
+        <w:t xml:space="preserve">: 'root', </w:t>
       </w:r>
       <w:proofErr w:type="spellStart"/>
       <w:r>
@@ -14959,7 +15033,23 @@
       </w:r>
       <w:proofErr w:type="spellEnd"/>
       <w:r>
-        <w:t>: 'admin' }] }); }"</w:t>
+        <w:t>: 'admin</w:t>
+      </w:r>
+      <w:proofErr w:type="gramStart"/>
+      <w:r>
+        <w:t>' }</w:t>
+      </w:r>
+      <w:proofErr w:type="gramEnd"/>
+      <w:r>
+        <w:t>] })</w:t>
+      </w:r>
+      <w:proofErr w:type="gramStart"/>
+      <w:r>
+        <w:t>; }</w:t>
+      </w:r>
+      <w:proofErr w:type="gramEnd"/>
+      <w:r>
+        <w:t>"</w:t>
       </w:r>
     </w:p>
     <w:p>
@@ -14995,39 +15085,103 @@
       <w:proofErr w:type="spellEnd"/>
       <w:proofErr w:type="gramEnd"/>
       <w:r>
-        <w:t>('admin'); if (!</w:t>
-      </w:r>
-      <w:proofErr w:type="spellStart"/>
-      <w:r>
-        <w:t>db.getUser</w:t>
-      </w:r>
-      <w:proofErr w:type="spellEnd"/>
-      <w:r>
-        <w:t xml:space="preserve">('{{ </w:t>
-      </w:r>
-      <w:proofErr w:type="spellStart"/>
-      <w:r>
-        <w:t>mongo_admin_user</w:t>
-      </w:r>
-      <w:proofErr w:type="spellEnd"/>
-      <w:r>
-        <w:t xml:space="preserve"> }}')) { </w:t>
-      </w:r>
-      <w:proofErr w:type="spellStart"/>
-      <w:r>
-        <w:t>db.createUser</w:t>
-      </w:r>
-      <w:proofErr w:type="spellEnd"/>
-      <w:r>
-        <w:t xml:space="preserve">({ user: '{{ </w:t>
-      </w:r>
-      <w:proofErr w:type="spellStart"/>
-      <w:r>
-        <w:t>mongo_admin_user</w:t>
-      </w:r>
-      <w:proofErr w:type="spellEnd"/>
-      <w:r>
-        <w:t xml:space="preserve"> }}', </w:t>
+        <w:t xml:space="preserve">('admin'); if </w:t>
+      </w:r>
+      <w:proofErr w:type="gramStart"/>
+      <w:r>
+        <w:t>(!</w:t>
+      </w:r>
+      <w:proofErr w:type="spellStart"/>
+      <w:r>
+        <w:t>db</w:t>
+      </w:r>
+      <w:proofErr w:type="gramEnd"/>
+      <w:r>
+        <w:t>.</w:t>
+      </w:r>
+      <w:proofErr w:type="gramStart"/>
+      <w:r>
+        <w:t>getUser</w:t>
+      </w:r>
+      <w:proofErr w:type="spellEnd"/>
+      <w:r>
+        <w:t>(</w:t>
+      </w:r>
+      <w:proofErr w:type="gramEnd"/>
+      <w:r>
+        <w:t>'</w:t>
+      </w:r>
+      <w:proofErr w:type="gramStart"/>
+      <w:r>
+        <w:t xml:space="preserve">{{ </w:t>
+      </w:r>
+      <w:proofErr w:type="spellStart"/>
+      <w:r>
+        <w:t>mongo</w:t>
+      </w:r>
+      <w:proofErr w:type="gramEnd"/>
+      <w:r>
+        <w:t>_admin_</w:t>
+      </w:r>
+      <w:proofErr w:type="gramStart"/>
+      <w:r>
+        <w:t>user</w:t>
+      </w:r>
+      <w:proofErr w:type="spellEnd"/>
+      <w:r>
+        <w:t xml:space="preserve"> }}'</w:t>
+      </w:r>
+      <w:proofErr w:type="gramEnd"/>
+      <w:r>
+        <w:t xml:space="preserve">)) </w:t>
+      </w:r>
+      <w:proofErr w:type="gramStart"/>
+      <w:r>
+        <w:t xml:space="preserve">{ </w:t>
+      </w:r>
+      <w:proofErr w:type="spellStart"/>
+      <w:r>
+        <w:t>db</w:t>
+      </w:r>
+      <w:proofErr w:type="gramEnd"/>
+      <w:r>
+        <w:t>.</w:t>
+      </w:r>
+      <w:proofErr w:type="gramStart"/>
+      <w:r>
+        <w:t>createUser</w:t>
+      </w:r>
+      <w:proofErr w:type="spellEnd"/>
+      <w:r>
+        <w:t>({ user</w:t>
+      </w:r>
+      <w:proofErr w:type="gramEnd"/>
+      <w:r>
+        <w:t>: '</w:t>
+      </w:r>
+      <w:proofErr w:type="gramStart"/>
+      <w:r>
+        <w:t xml:space="preserve">{{ </w:t>
+      </w:r>
+      <w:proofErr w:type="spellStart"/>
+      <w:r>
+        <w:t>mongo</w:t>
+      </w:r>
+      <w:proofErr w:type="gramEnd"/>
+      <w:r>
+        <w:t>_admin_</w:t>
+      </w:r>
+      <w:proofErr w:type="gramStart"/>
+      <w:r>
+        <w:t>user</w:t>
+      </w:r>
+      <w:proofErr w:type="spellEnd"/>
+      <w:r>
+        <w:t xml:space="preserve"> }}'</w:t>
+      </w:r>
+      <w:proofErr w:type="gramEnd"/>
+      <w:r>
+        <w:t xml:space="preserve">, </w:t>
       </w:r>
       <w:proofErr w:type="spellStart"/>
       <w:r>
@@ -15035,15 +15189,39 @@
       </w:r>
       <w:proofErr w:type="spellEnd"/>
       <w:r>
-        <w:t xml:space="preserve">: '{{ </w:t>
-      </w:r>
-      <w:proofErr w:type="spellStart"/>
-      <w:r>
-        <w:t>mongo_admin_password</w:t>
-      </w:r>
-      <w:proofErr w:type="spellEnd"/>
-      <w:r>
-        <w:t xml:space="preserve"> }}', roles: [{ role: 'root', </w:t>
+        <w:t>: '</w:t>
+      </w:r>
+      <w:proofErr w:type="gramStart"/>
+      <w:r>
+        <w:t xml:space="preserve">{{ </w:t>
+      </w:r>
+      <w:proofErr w:type="spellStart"/>
+      <w:r>
+        <w:t>mongo</w:t>
+      </w:r>
+      <w:proofErr w:type="gramEnd"/>
+      <w:r>
+        <w:t>_admin_</w:t>
+      </w:r>
+      <w:proofErr w:type="gramStart"/>
+      <w:r>
+        <w:t>password</w:t>
+      </w:r>
+      <w:proofErr w:type="spellEnd"/>
+      <w:r>
+        <w:t xml:space="preserve"> }}'</w:t>
+      </w:r>
+      <w:proofErr w:type="gramEnd"/>
+      <w:r>
+        <w:t xml:space="preserve">, roles: </w:t>
+      </w:r>
+      <w:proofErr w:type="gramStart"/>
+      <w:r>
+        <w:t>[{ role</w:t>
+      </w:r>
+      <w:proofErr w:type="gramEnd"/>
+      <w:r>
+        <w:t xml:space="preserve">: 'root', </w:t>
       </w:r>
       <w:proofErr w:type="spellStart"/>
       <w:r>
@@ -15051,7 +15229,23 @@
       </w:r>
       <w:proofErr w:type="spellEnd"/>
       <w:r>
-        <w:t>: 'admin' }] }); }"</w:t>
+        <w:t>: 'admin</w:t>
+      </w:r>
+      <w:proofErr w:type="gramStart"/>
+      <w:r>
+        <w:t>' }</w:t>
+      </w:r>
+      <w:proofErr w:type="gramEnd"/>
+      <w:r>
+        <w:t>] })</w:t>
+      </w:r>
+      <w:proofErr w:type="gramStart"/>
+      <w:r>
+        <w:t>; }</w:t>
+      </w:r>
+      <w:proofErr w:type="gramEnd"/>
+      <w:r>
+        <w:t>"</w:t>
       </w:r>
     </w:p>
     <w:p>
@@ -15338,15 +15532,7 @@
       </w:r>
       <w:proofErr w:type="spellEnd"/>
       <w:r>
-        <w:t>/</w:t>
-      </w:r>
-      <w:proofErr w:type="spellStart"/>
-      <w:r>
-        <w:t>ssh</w:t>
-      </w:r>
-      <w:proofErr w:type="spellEnd"/>
-      <w:r>
-        <w:t>/</w:t>
+        <w:t>/ssh/</w:t>
       </w:r>
       <w:proofErr w:type="spellStart"/>
       <w:r>
@@ -15407,13 +15593,8 @@
     </w:p>
     <w:p>
       <w:r>
-        <w:t xml:space="preserve">        name: </w:t>
-      </w:r>
-      <w:proofErr w:type="spellStart"/>
-      <w:r>
-        <w:t>ssh</w:t>
-      </w:r>
-      <w:proofErr w:type="spellEnd"/>
+        <w:t xml:space="preserve">        name: ssh</w:t>
+      </w:r>
     </w:p>
     <w:p>
       <w:r>
@@ -15539,11 +15720,19 @@
       </w:r>
       <w:proofErr w:type="gramEnd"/>
       <w:r>
-        <w:t>_dir</w:t>
-      </w:r>
-      <w:proofErr w:type="spellEnd"/>
-      <w:r>
-        <w:t xml:space="preserve"> }}/frontend"</w:t>
+        <w:t>_</w:t>
+      </w:r>
+      <w:proofErr w:type="gramStart"/>
+      <w:r>
+        <w:t>dir</w:t>
+      </w:r>
+      <w:proofErr w:type="spellEnd"/>
+      <w:r>
+        <w:t xml:space="preserve"> }}/</w:t>
+      </w:r>
+      <w:proofErr w:type="gramEnd"/>
+      <w:r>
+        <w:t>frontend"</w:t>
       </w:r>
     </w:p>
     <w:p>
@@ -15568,11 +15757,19 @@
       </w:r>
       <w:proofErr w:type="gramEnd"/>
       <w:r>
-        <w:t>_dir</w:t>
-      </w:r>
-      <w:proofErr w:type="spellEnd"/>
-      <w:r>
-        <w:t xml:space="preserve"> }}/backend"</w:t>
+        <w:t>_</w:t>
+      </w:r>
+      <w:proofErr w:type="gramStart"/>
+      <w:r>
+        <w:t>dir</w:t>
+      </w:r>
+      <w:proofErr w:type="spellEnd"/>
+      <w:r>
+        <w:t xml:space="preserve"> }}/</w:t>
+      </w:r>
+      <w:proofErr w:type="gramEnd"/>
+      <w:r>
+        <w:t>backend"</w:t>
       </w:r>
     </w:p>
     <w:p>
@@ -15779,12 +15976,17 @@
       </w:r>
       <w:proofErr w:type="gramEnd"/>
       <w:r>
-        <w:t>_dir</w:t>
+        <w:t>_</w:t>
+      </w:r>
+      <w:proofErr w:type="gramStart"/>
+      <w:r>
+        <w:t>dir</w:t>
       </w:r>
       <w:proofErr w:type="spellEnd"/>
       <w:r>
         <w:t xml:space="preserve"> }}"</w:t>
       </w:r>
+      <w:proofErr w:type="gramEnd"/>
     </w:p>
     <w:p>
       <w:r>
@@ -15816,12 +16018,17 @@
       </w:r>
       <w:proofErr w:type="gramEnd"/>
       <w:r>
-        <w:t>_dir</w:t>
+        <w:t>_</w:t>
+      </w:r>
+      <w:proofErr w:type="gramStart"/>
+      <w:r>
+        <w:t>dir</w:t>
       </w:r>
       <w:proofErr w:type="spellEnd"/>
       <w:r>
         <w:t xml:space="preserve"> }}"</w:t>
       </w:r>
+      <w:proofErr w:type="gramEnd"/>
     </w:p>
     <w:p>
       <w:r>
@@ -15987,12 +16194,17 @@
       </w:r>
       <w:proofErr w:type="gramEnd"/>
       <w:r>
-        <w:t>_dir</w:t>
+        <w:t>_</w:t>
+      </w:r>
+      <w:proofErr w:type="gramStart"/>
+      <w:r>
+        <w:t>dir</w:t>
       </w:r>
       <w:proofErr w:type="spellEnd"/>
       <w:r>
         <w:t xml:space="preserve"> }}"</w:t>
       </w:r>
+      <w:proofErr w:type="gramEnd"/>
     </w:p>
     <w:p>
       <w:r>
@@ -16024,19 +16236,32 @@
       </w:r>
       <w:proofErr w:type="gramStart"/>
       <w:r>
-        <w:t>={</w:t>
+        <w:t xml:space="preserve">={{ </w:t>
+      </w:r>
+      <w:proofErr w:type="spellStart"/>
+      <w:r>
+        <w:t>npm</w:t>
       </w:r>
       <w:proofErr w:type="gramEnd"/>
       <w:r>
-        <w:t xml:space="preserve">{ </w:t>
-      </w:r>
-      <w:proofErr w:type="spellStart"/>
-      <w:r>
-        <w:t>npm_global_bin.stdout</w:t>
-      </w:r>
-      <w:proofErr w:type="spellEnd"/>
-      <w:r>
-        <w:t xml:space="preserve"> }}:$PATH pm2 delete backend || true</w:t>
+        <w:t>_global_</w:t>
+      </w:r>
+      <w:proofErr w:type="gramStart"/>
+      <w:r>
+        <w:t>bin.stdout</w:t>
+      </w:r>
+      <w:proofErr w:type="spellEnd"/>
+      <w:proofErr w:type="gramEnd"/>
+      <w:r>
+        <w:t xml:space="preserve"> }</w:t>
+      </w:r>
+      <w:proofErr w:type="gramStart"/>
+      <w:r>
+        <w:t>}:$</w:t>
+      </w:r>
+      <w:proofErr w:type="gramEnd"/>
+      <w:r>
+        <w:t>PATH pm2 delete backend || true</w:t>
       </w:r>
     </w:p>
     <w:p>
@@ -16098,12 +16323,17 @@
       </w:r>
       <w:proofErr w:type="gramEnd"/>
       <w:r>
-        <w:t>_dir</w:t>
+        <w:t>_</w:t>
+      </w:r>
+      <w:proofErr w:type="gramStart"/>
+      <w:r>
+        <w:t>dir</w:t>
       </w:r>
       <w:proofErr w:type="spellEnd"/>
       <w:r>
         <w:t xml:space="preserve"> }}"</w:t>
       </w:r>
+      <w:proofErr w:type="gramEnd"/>
     </w:p>
     <w:p>
       <w:r>
@@ -16179,12 +16409,17 @@
       </w:r>
       <w:proofErr w:type="gramEnd"/>
       <w:r>
-        <w:t>_dir</w:t>
+        <w:t>_</w:t>
+      </w:r>
+      <w:proofErr w:type="gramStart"/>
+      <w:r>
+        <w:t>dir</w:t>
       </w:r>
       <w:proofErr w:type="spellEnd"/>
       <w:r>
         <w:t xml:space="preserve"> }}"</w:t>
       </w:r>
+      <w:proofErr w:type="gramEnd"/>
     </w:p>
     <w:p>
       <w:r>
@@ -16215,10 +16450,12 @@
         <w:t xml:space="preserve">    #     </w:t>
       </w:r>
       <w:proofErr w:type="spellStart"/>
+      <w:proofErr w:type="gramStart"/>
       <w:r>
         <w:t>dest</w:t>
       </w:r>
       <w:proofErr w:type="spellEnd"/>
+      <w:proofErr w:type="gramEnd"/>
       <w:r>
         <w:t>: "</w:t>
       </w:r>
@@ -16232,11 +16469,19 @@
       </w:r>
       <w:proofErr w:type="gramEnd"/>
       <w:r>
-        <w:t>_dir</w:t>
-      </w:r>
-      <w:proofErr w:type="spellEnd"/>
-      <w:r>
-        <w:t xml:space="preserve"> }}/.env"</w:t>
+        <w:t>_</w:t>
+      </w:r>
+      <w:proofErr w:type="gramStart"/>
+      <w:r>
+        <w:t>dir</w:t>
+      </w:r>
+      <w:proofErr w:type="spellEnd"/>
+      <w:r>
+        <w:t xml:space="preserve"> }}/</w:t>
+      </w:r>
+      <w:proofErr w:type="gramEnd"/>
+      <w:r>
+        <w:t>.env"</w:t>
       </w:r>
     </w:p>
     <w:p>
@@ -16250,19 +16495,27 @@
       </w:r>
       <w:proofErr w:type="gramStart"/>
       <w:r>
-        <w:t>={</w:t>
+        <w:t xml:space="preserve">={{ </w:t>
+      </w:r>
+      <w:proofErr w:type="spellStart"/>
+      <w:r>
+        <w:t>backend</w:t>
       </w:r>
       <w:proofErr w:type="gramEnd"/>
       <w:r>
-        <w:t xml:space="preserve">{ </w:t>
-      </w:r>
-      <w:proofErr w:type="spellStart"/>
-      <w:r>
-        <w:t>backend_url</w:t>
-      </w:r>
-      <w:proofErr w:type="spellEnd"/>
-      <w:r>
-        <w:t xml:space="preserve"> }}</w:t>
+        <w:t>_</w:t>
+      </w:r>
+      <w:proofErr w:type="gramStart"/>
+      <w:r>
+        <w:t>url</w:t>
+      </w:r>
+      <w:proofErr w:type="spellEnd"/>
+      <w:r>
+        <w:t xml:space="preserve"> }</w:t>
+      </w:r>
+      <w:proofErr w:type="gramEnd"/>
+      <w:r>
+        <w:t>}</w:t>
       </w:r>
     </w:p>
     <w:p>
@@ -16332,12 +16585,17 @@
       </w:r>
       <w:proofErr w:type="gramEnd"/>
       <w:r>
-        <w:t>_dir</w:t>
+        <w:t>_</w:t>
+      </w:r>
+      <w:proofErr w:type="gramStart"/>
+      <w:r>
+        <w:t>dir</w:t>
       </w:r>
       <w:proofErr w:type="spellEnd"/>
       <w:r>
         <w:t xml:space="preserve"> }}"</w:t>
       </w:r>
+      <w:proofErr w:type="gramEnd"/>
     </w:p>
     <w:p>
       <w:r>
@@ -16403,19 +16661,32 @@
       </w:r>
       <w:proofErr w:type="gramStart"/>
       <w:r>
-        <w:t>={</w:t>
+        <w:t xml:space="preserve">={{ </w:t>
+      </w:r>
+      <w:proofErr w:type="spellStart"/>
+      <w:r>
+        <w:t>npm</w:t>
       </w:r>
       <w:proofErr w:type="gramEnd"/>
       <w:r>
-        <w:t xml:space="preserve">{ </w:t>
-      </w:r>
-      <w:proofErr w:type="spellStart"/>
-      <w:r>
-        <w:t>npm_global_bin.stdout</w:t>
-      </w:r>
-      <w:proofErr w:type="spellEnd"/>
-      <w:r>
-        <w:t xml:space="preserve"> }}:$PATH pm2 delete frontend || true</w:t>
+        <w:t>_global_</w:t>
+      </w:r>
+      <w:proofErr w:type="gramStart"/>
+      <w:r>
+        <w:t>bin.stdout</w:t>
+      </w:r>
+      <w:proofErr w:type="spellEnd"/>
+      <w:proofErr w:type="gramEnd"/>
+      <w:r>
+        <w:t xml:space="preserve"> }</w:t>
+      </w:r>
+      <w:proofErr w:type="gramStart"/>
+      <w:r>
+        <w:t>}:$</w:t>
+      </w:r>
+      <w:proofErr w:type="gramEnd"/>
+      <w:r>
+        <w:t>PATH pm2 delete frontend || true</w:t>
       </w:r>
     </w:p>
     <w:p>
@@ -16485,12 +16756,17 @@
       </w:r>
       <w:proofErr w:type="gramEnd"/>
       <w:r>
-        <w:t>_dir</w:t>
+        <w:t>_</w:t>
+      </w:r>
+      <w:proofErr w:type="gramStart"/>
+      <w:r>
+        <w:t>dir</w:t>
       </w:r>
       <w:proofErr w:type="spellEnd"/>
       <w:r>
         <w:t xml:space="preserve"> }}"</w:t>
       </w:r>
+      <w:proofErr w:type="gramEnd"/>
     </w:p>
     <w:p>
       <w:r>
@@ -17559,6 +17835,29 @@
           <w:sz w:val="32"/>
         </w:rPr>
       </w:pPr>
+      <w:r>
+        <w:rPr>
+          <w:b/>
+          <w:sz w:val="32"/>
+        </w:rPr>
+        <w:t>/</w:t>
+      </w:r>
+      <w:proofErr w:type="gramStart"/>
+      <w:r>
+        <w:rPr>
+          <w:b/>
+          <w:sz w:val="32"/>
+        </w:rPr>
+        <w:t>mnt</w:t>
+      </w:r>
+      <w:proofErr w:type="gramEnd"/>
+      <w:r>
+        <w:rPr>
+          <w:b/>
+          <w:sz w:val="32"/>
+        </w:rPr>
+        <w:t>/c/herovired/travelmemory-deployment-ansible-terraform/travelmemory-deployment-ansible-terraform/ansible</w:t>
+      </w:r>
     </w:p>
     <w:p>
       <w:pPr>
@@ -17909,7 +18208,6 @@
           <w:sz w:val="32"/>
         </w:rPr>
       </w:pPr>
-      <w:bookmarkStart w:id="0" w:name="_GoBack"/>
       <w:r>
         <w:rPr>
           <w:noProof/>
@@ -17950,7 +18248,6 @@
           </wp:inline>
         </w:drawing>
       </w:r>
-      <w:bookmarkEnd w:id="0"/>
     </w:p>
     <w:sectPr>
       <w:pgSz w:w="12240" w:h="15840"/>
@@ -17963,7 +18260,7 @@
 </file>
 
 <file path=word/numbering.xml><?xml version="1.0" encoding="utf-8"?>
-<w:numbering xmlns:wpc="http://schemas.microsoft.com/office/word/2010/wordprocessingCanvas" xmlns:cx="http://schemas.microsoft.com/office/drawing/2014/chartex" xmlns:cx1="http://schemas.microsoft.com/office/drawing/2015/9/8/chartex" xmlns:cx2="http://schemas.microsoft.com/office/drawing/2015/10/21/chartex" xmlns:cx3="http://schemas.microsoft.com/office/drawing/2016/5/9/chartex" xmlns:cx4="http://schemas.microsoft.com/office/drawing/2016/5/10/chartex" xmlns:cx5="http://schemas.microsoft.com/office/drawing/2016/5/11/chartex" xmlns:cx6="http://schemas.microsoft.com/office/drawing/2016/5/12/chartex" xmlns:cx7="http://schemas.microsoft.com/office/drawing/2016/5/13/chartex" xmlns:cx8="http://schemas.microsoft.com/office/drawing/2016/5/14/chartex" xmlns:mc="http://schemas.openxmlformats.org/markup-compatibility/2006" xmlns:aink="http://schemas.microsoft.com/office/drawing/2016/ink" xmlns:am3d="http://schemas.microsoft.com/office/drawing/2017/model3d" xmlns:o="urn:schemas-microsoft-com:office:office" xmlns:r="http://schemas.openxmlformats.org/officeDocument/2006/relationships" xmlns:m="http://schemas.openxmlformats.org/officeDocument/2006/math" xmlns:v="urn:schemas-microsoft-com:vml" xmlns:wp14="http://schemas.microsoft.com/office/word/2010/wordprocessingDrawing" xmlns:wp="http://schemas.openxmlformats.org/drawingml/2006/wordprocessingDrawing" xmlns:w10="urn:schemas-microsoft-com:office:word" xmlns:w="http://schemas.openxmlformats.org/wordprocessingml/2006/main" xmlns:w14="http://schemas.microsoft.com/office/word/2010/wordml" xmlns:w15="http://schemas.microsoft.com/office/word/2012/wordml" xmlns:w16cid="http://schemas.microsoft.com/office/word/2016/wordml/cid" xmlns:w16se="http://schemas.microsoft.com/office/word/2015/wordml/symex" xmlns:wpg="http://schemas.microsoft.com/office/word/2010/wordprocessingGroup" xmlns:wpi="http://schemas.microsoft.com/office/word/2010/wordprocessingInk" xmlns:wne="http://schemas.microsoft.com/office/word/2006/wordml" xmlns:wps="http://schemas.microsoft.com/office/word/2010/wordprocessingShape" mc:Ignorable="w14 w15 w16se w16cid wp14">
+<w:numbering xmlns:wpc="http://schemas.microsoft.com/office/word/2010/wordprocessingCanvas" xmlns:cx="http://schemas.microsoft.com/office/drawing/2014/chartex" xmlns:cx1="http://schemas.microsoft.com/office/drawing/2015/9/8/chartex" xmlns:cx2="http://schemas.microsoft.com/office/drawing/2015/10/21/chartex" xmlns:cx3="http://schemas.microsoft.com/office/drawing/2016/5/9/chartex" xmlns:cx4="http://schemas.microsoft.com/office/drawing/2016/5/10/chartex" xmlns:cx5="http://schemas.microsoft.com/office/drawing/2016/5/11/chartex" xmlns:cx6="http://schemas.microsoft.com/office/drawing/2016/5/12/chartex" xmlns:cx7="http://schemas.microsoft.com/office/drawing/2016/5/13/chartex" xmlns:cx8="http://schemas.microsoft.com/office/drawing/2016/5/14/chartex" xmlns:mc="http://schemas.openxmlformats.org/markup-compatibility/2006" xmlns:aink="http://schemas.microsoft.com/office/drawing/2016/ink" xmlns:am3d="http://schemas.microsoft.com/office/drawing/2017/model3d" xmlns:o="urn:schemas-microsoft-com:office:office" xmlns:oel="http://schemas.microsoft.com/office/2019/extlst" xmlns:r="http://schemas.openxmlformats.org/officeDocument/2006/relationships" xmlns:m="http://schemas.openxmlformats.org/officeDocument/2006/math" xmlns:v="urn:schemas-microsoft-com:vml" xmlns:wp14="http://schemas.microsoft.com/office/word/2010/wordprocessingDrawing" xmlns:wp="http://schemas.openxmlformats.org/drawingml/2006/wordprocessingDrawing" xmlns:w10="urn:schemas-microsoft-com:office:word" xmlns:w="http://schemas.openxmlformats.org/wordprocessingml/2006/main" xmlns:w14="http://schemas.microsoft.com/office/word/2010/wordml" xmlns:w15="http://schemas.microsoft.com/office/word/2012/wordml" xmlns:w16cex="http://schemas.microsoft.com/office/word/2018/wordml/cex" xmlns:w16cid="http://schemas.microsoft.com/office/word/2016/wordml/cid" xmlns:w16="http://schemas.microsoft.com/office/word/2018/wordml" xmlns:w16du="http://schemas.microsoft.com/office/word/2023/wordml/word16du" xmlns:w16sdtdh="http://schemas.microsoft.com/office/word/2020/wordml/sdtdatahash" xmlns:w16sdtfl="http://schemas.microsoft.com/office/word/2024/wordml/sdtformatlock" xmlns:w16se="http://schemas.microsoft.com/office/word/2015/wordml/symex" xmlns:wpg="http://schemas.microsoft.com/office/word/2010/wordprocessingGroup" xmlns:wpi="http://schemas.microsoft.com/office/word/2010/wordprocessingInk" xmlns:wne="http://schemas.microsoft.com/office/word/2006/wordml" xmlns:wps="http://schemas.microsoft.com/office/word/2010/wordprocessingShape" mc:Ignorable="w14 w15 w16se w16cid w16 w16cex w16sdtdh w16sdtfl w16du wp14">
   <w:abstractNum w:abstractNumId="0" w15:restartNumberingAfterBreak="0">
     <w:nsid w:val="21D46D51"/>
     <w:multiLevelType w:val="hybridMultilevel"/>
@@ -18320,23 +18617,23 @@
       </w:pPr>
     </w:lvl>
   </w:abstractNum>
-  <w:num w:numId="1">
+  <w:num w:numId="1" w16cid:durableId="402070678">
     <w:abstractNumId w:val="1"/>
   </w:num>
-  <w:num w:numId="2">
+  <w:num w:numId="2" w16cid:durableId="598758805">
     <w:abstractNumId w:val="3"/>
   </w:num>
-  <w:num w:numId="3">
+  <w:num w:numId="3" w16cid:durableId="866141790">
     <w:abstractNumId w:val="0"/>
   </w:num>
-  <w:num w:numId="4">
+  <w:num w:numId="4" w16cid:durableId="381755904">
     <w:abstractNumId w:val="2"/>
   </w:num>
 </w:numbering>
 </file>
 
 <file path=word/styles.xml><?xml version="1.0" encoding="utf-8"?>
-<w:styles xmlns:mc="http://schemas.openxmlformats.org/markup-compatibility/2006" xmlns:r="http://schemas.openxmlformats.org/officeDocument/2006/relationships" xmlns:w="http://schemas.openxmlformats.org/wordprocessingml/2006/main" xmlns:w14="http://schemas.microsoft.com/office/word/2010/wordml" xmlns:w15="http://schemas.microsoft.com/office/word/2012/wordml" xmlns:w16cid="http://schemas.microsoft.com/office/word/2016/wordml/cid" xmlns:w16se="http://schemas.microsoft.com/office/word/2015/wordml/symex" mc:Ignorable="w14 w15 w16se w16cid">
+<w:styles xmlns:mc="http://schemas.openxmlformats.org/markup-compatibility/2006" xmlns:r="http://schemas.openxmlformats.org/officeDocument/2006/relationships" xmlns:w="http://schemas.openxmlformats.org/wordprocessingml/2006/main" xmlns:w14="http://schemas.microsoft.com/office/word/2010/wordml" xmlns:w15="http://schemas.microsoft.com/office/word/2012/wordml" xmlns:w16cex="http://schemas.microsoft.com/office/word/2018/wordml/cex" xmlns:w16cid="http://schemas.microsoft.com/office/word/2016/wordml/cid" xmlns:w16="http://schemas.microsoft.com/office/word/2018/wordml" xmlns:w16du="http://schemas.microsoft.com/office/word/2023/wordml/word16du" xmlns:w16sdtdh="http://schemas.microsoft.com/office/word/2020/wordml/sdtdatahash" xmlns:w16sdtfl="http://schemas.microsoft.com/office/word/2024/wordml/sdtformatlock" xmlns:w16se="http://schemas.microsoft.com/office/word/2015/wordml/symex" mc:Ignorable="w14 w15 w16se w16cid w16 w16cex w16sdtdh w16sdtfl w16du">
   <w:docDefaults>
     <w:rPrDefault>
       <w:rPr>
@@ -18352,7 +18649,7 @@
       </w:pPr>
     </w:pPrDefault>
   </w:docDefaults>
-  <w:latentStyles w:defLockedState="0" w:defUIPriority="99" w:defSemiHidden="0" w:defUnhideWhenUsed="0" w:defQFormat="0" w:count="375">
+  <w:latentStyles w:defLockedState="0" w:defUIPriority="99" w:defSemiHidden="0" w:defUnhideWhenUsed="0" w:defQFormat="0" w:count="376">
     <w:lsdException w:name="Normal" w:uiPriority="0" w:qFormat="1"/>
     <w:lsdException w:name="heading 1" w:uiPriority="9" w:qFormat="1"/>
     <w:lsdException w:name="heading 2" w:semiHidden="1" w:uiPriority="9" w:unhideWhenUsed="1" w:qFormat="1"/>
@@ -18728,6 +19025,7 @@
     <w:lsdException w:name="Smart Hyperlink" w:semiHidden="1" w:unhideWhenUsed="1"/>
     <w:lsdException w:name="Hashtag" w:semiHidden="1" w:unhideWhenUsed="1"/>
     <w:lsdException w:name="Unresolved Mention" w:semiHidden="1" w:unhideWhenUsed="1"/>
+    <w:lsdException w:name="Smart Link" w:semiHidden="1" w:unhideWhenUsed="1"/>
   </w:latentStyles>
   <w:style w:type="paragraph" w:default="1" w:styleId="Normal">
     <w:name w:val="Normal"/>

</xml_diff>